<commit_message>
Programmes batches 5-6: Azure, System Design, Spark & Kafka, Blockchain (EN + FR)
Cold-read fixes: AZ-104 and AZ-400 outline coverage, lab feasibility (Entra
P2 trial, push protection), prerequisite citations, Confluent licence, Microsoft
French terms. Course 29 and other AI drafts included; total row now names the
optional phase.

Co-Authored-By: Claude Opus 5.5 <noreply@anthropic.com>
</commit_message>
<xml_diff>
--- a/res/programmes/Azure-Administrator-42h-FR.docx
+++ b/res/programmes/Azure-Administrator-42h-FR.docx
@@ -92,7 +92,7 @@
         <w:t>Pour</w:t>
       </w:r>
       <w:r>
-        <w:t xml:space="preserve">   Administrateurs système et ingénieurs IT qui exploitent des environnements Microsoft Azure</w:t>
+        <w:t xml:space="preserve">   Administrateurs système et ingénieurs IT qui exploitent Microsoft Azure</w:t>
       </w:r>
     </w:p>
     <w:p>
@@ -212,7 +212,7 @@
         <w:pStyle w:val="ProgBody"/>
       </w:pPr>
       <w:r>
-        <w:t>Ce programme apprend aux participants à administrer Microsoft Azure et prépare l’examen AZ-104 de la certification Azure Administrator Associate. Ils organisent abonnements et ressources, gèrent les identités dans Microsoft Entra ID, gouvernent accès et coûts avec RBAC, Azure Policy et les étiquettes, construisent des réseaux virtuels avec accès sécurisé, DNS et répartition de charge, gèrent des comptes de stockage, déploient des machines virtuelles avec des modèles ARM et Bicep, exécutent applications web et conteneurs, et supervisent et protègent les charges de travail avec Azure Monitor, Azure Backup et Site Recovery. Chaque chapitre se termine par un TP dans le portail, la CLI ou PowerShell, un entraînement à l’examen clôt le contenu, et le programme s’achève par un projet final : l’environnement Azure d’une entreprise, construit et présenté par chaque équipe.</w:t>
+        <w:t>Ce programme apprend aux participants à administrer Microsoft Azure et prépare l’examen AZ-104 de la certification Azure Administrator Associate. Ils organisent abonnements et ressources, gèrent les identités dans Microsoft Entra ID, gouvernent accès et coûts avec RBAC, Azure Policy et les étiquettes, construisent des réseaux virtuels sécurisés, gèrent le stockage, déploient des machines virtuelles avec Bicep, exécutent applications web et conteneurs, et supervisent et protègent les charges de travail avec Azure Monitor et Azure Backup. Un entraînement à l’examen clôt le contenu, et le programme s’achève par l’environnement Azure d’une entreprise, construit et présenté par chaque équipe.</w:t>
       </w:r>
     </w:p>
     <w:p>
@@ -335,7 +335,7 @@
               <w:keepNext/>
             </w:pPr>
             <w:r>
-              <w:t>Abonnements et Resource Manager, Microsoft Entra ID, RBAC, Azure Policy, coûts</w:t>
+              <w:t>Resource Manager, Microsoft Entra ID, RBAC, Azure Policy, coûts</w:t>
             </w:r>
           </w:p>
         </w:tc>
@@ -393,7 +393,7 @@
               <w:keepNext/>
             </w:pPr>
             <w:r>
-              <w:t>VNet, peering, routes, NSG, Bastion, points de terminaison privés, DNS, répartition de charge</w:t>
+              <w:t>VNet, NSG, Bastion, points de terminaison privés, DNS</w:t>
             </w:r>
           </w:p>
         </w:tc>
@@ -451,7 +451,7 @@
               <w:keepNext/>
             </w:pPr>
             <w:r>
-              <w:t>Comptes de stockage, machines virtuelles et groupes identiques, Bicep, App Service, conteneurs</w:t>
+              <w:t>Stockage, VM et groupes identiques, Bicep, App Service, conteneurs</w:t>
             </w:r>
           </w:p>
         </w:tc>
@@ -495,7 +495,7 @@
               <w:keepNext/>
             </w:pPr>
             <w:r>
-              <w:t>Supervision, sauvegarde et préparation à l’examen</w:t>
+              <w:t>Supervision et sauvegarde</w:t>
             </w:r>
           </w:p>
         </w:tc>
@@ -509,7 +509,7 @@
               <w:keepNext/>
             </w:pPr>
             <w:r>
-              <w:t>Azure Monitor, Log Analytics, Network Watcher, Azure Backup, Site Recovery, AZ-104</w:t>
+              <w:t>Azure Monitor, Network Watcher, Azure Backup, AZ-104</w:t>
             </w:r>
           </w:p>
         </w:tc>
@@ -754,7 +754,7 @@
               <w:pStyle w:val="ProgTableText"/>
             </w:pPr>
             <w:r>
-              <w:t>Administrateurs système et ingénieurs IT qui exploitent des environnements Microsoft Azure</w:t>
+              <w:t>Administrateurs système et ingénieurs IT qui exploitent Microsoft Azure</w:t>
             </w:r>
           </w:p>
         </w:tc>
@@ -838,7 +838,7 @@
               <w:pStyle w:val="ProgTableText"/>
             </w:pPr>
             <w:r>
-              <w:t>Cours courts suivis de TP guidés dans le portail Azure, Azure CLI et PowerShell ; entraînement à l’examen</w:t>
+              <w:t>Cours courts et TP guidés (portail, Azure CLI, PowerShell) ; entraînement à l’examen</w:t>
             </w:r>
           </w:p>
         </w:tc>
@@ -866,7 +866,7 @@
               <w:pStyle w:val="ProgTableText"/>
             </w:pPr>
             <w:r>
-              <w:t>Un portable par participant avec un navigateur, Azure CLI, PowerShell et VS Code avec Bicep ; un abonnement Azure par équipe avec alerte budgétaire et un locataire Microsoft Entra de test, fournis par l’organisateur ; groupes de ressources supprimés à la fin de chaque TP pour maîtriser les coûts</w:t>
+              <w:t>Un portable par participant (navigateur, Azure CLI, PowerShell, VS Code avec Bicep) ; par équipe, un abonnement Azure dans son propre locataire Microsoft Entra de test avec un essai Entra ID P2 et une alerte budgétaire, fournis par l’organisateur ; groupes de ressources supprimés après chaque TP pour maîtriser les coûts</w:t>
             </w:r>
           </w:p>
         </w:tc>
@@ -894,7 +894,7 @@
               <w:pStyle w:val="ProgTableText"/>
             </w:pPr>
             <w:r>
-              <w:t>Un TP validé à la fin de chaque phase, des questions d’entraînement à l’examen et un projet final présenté au groupe ; attestation de formation pour les participants qui valident les TP et le projet</w:t>
+              <w:t>Un TP validé par phase, des questions d’entraînement à l’examen et un projet final présenté au groupe ; attestation de formation pour les participants qui valident les TP et le projet</w:t>
             </w:r>
           </w:p>
         </w:tc>
@@ -922,7 +922,7 @@
               <w:pStyle w:val="ProgTableText"/>
             </w:pPr>
             <w:r>
-              <w:t>Les participants savent construire et gouverner un environnement Azure avec identités, politiques, réseaux, stockage, machines virtuelles, supervision et sauvegarde, et se présenter à l’examen AZ-104</w:t>
+              <w:t>Les participants savent construire et gouverner un environnement Azure avec identités, stratégies, réseaux, stockage, machines virtuelles, supervision et sauvegarde, et se présenter à l’examen AZ-104</w:t>
             </w:r>
           </w:p>
         </w:tc>
@@ -951,7 +951,7 @@
         <w:pStyle w:val="ProgIntro"/>
       </w:pPr>
       <w:r>
-        <w:t>Les participants découvrent comment Azure est organisé et s’administre depuis le portail, la CLI et PowerShell, gèrent utilisateurs, groupes et identités externes dans Microsoft Entra ID, puis gouvernent accès et dépenses avec RBAC, Azure Policy, les groupes d’administration, les étiquettes, les verrous et la gestion des coûts. TP validé : une hiérarchie de groupes d’administration où une politique limite les Régions autorisées, une équipe disposant du rôle Contributeur sur son seul groupe de ressources, et un budget qui déclenche une alerte.</w:t>
+        <w:t>Les participants découvrent comment Azure est organisé et s’administre depuis le portail, la CLI et PowerShell, gèrent utilisateurs, groupes et identités externes dans Microsoft Entra ID, puis gouvernent accès et dépenses avec RBAC, Azure Policy, les groupes d’administration, les étiquettes, les verrous et la gestion des coûts. TP validé : une hiérarchie de groupes d’administration qui applique la stratégie Allowed locations, une équipe disposant du rôle Contributeur sur son seul groupe de ressources, et un budget qui déclenche une alerte.</w:t>
       </w:r>
     </w:p>
     <w:tbl>
@@ -1207,7 +1207,7 @@
               <w:pStyle w:val="ProgTableText"/>
             </w:pPr>
             <w:r>
-              <w:t>RBAC, Azure Policy, groupes d’administration, étiquettes, verrous, gestion des coûts</w:t>
+              <w:t>RBAC, Azure Policy, groupes d’administration, étiquettes, verrous, gestion des coûts, Azure Advisor, déplacement de ressources</w:t>
             </w:r>
           </w:p>
         </w:tc>
@@ -1262,7 +1262,7 @@
         <w:pStyle w:val="ProgIntro"/>
       </w:pPr>
       <w:r>
-        <w:t>Les participants construisent et relient des réseaux virtuels, filtrent le trafic avec des groupes de sécurité réseau et d’application, accèdent aux machines de façon sécurisée via Azure Bastion et aux services via des points de terminaison privés, résolvent les noms avec Azure DNS, et répartissent le trafic avec Azure Load Balancer et Application Gateway. TP validé : deux VNet appairés où une VM sans IP publique n’est joignable que par Bastion et lit un compte de stockage via un point de terminaison privé.</w:t>
+        <w:t>Les participants construisent et relient des réseaux virtuels, filtrent le trafic avec des groupes de sécurité réseau et d’application, accèdent aux machines de façon sécurisée via Azure Bastion et aux services via des points de terminaison privés, résolvent les noms avec Azure DNS, et répartissent le trafic avec Azure Load Balancer et Application Gateway. TP validé : deux VNet appairés où une VM sans IP publique n’est joignable que par Bastion et lit un compte de stockage, créé depuis un fichier Bicep fourni, via un point de terminaison privé.</w:t>
       </w:r>
     </w:p>
     <w:tbl>
@@ -1695,7 +1695,7 @@
               <w:pStyle w:val="ProgTableText"/>
             </w:pPr>
             <w:r>
-              <w:t>Comptes de stockage, Blob, Files, contrôle d’accès, redondance, gestion du cycle de vie</w:t>
+              <w:t>Comptes de stockage, redondance, chiffrement ; clés d’accès, SAS et stratégies d’accès stockées, pare-feu, accès basé sur l’identité à Azure Files ; niveaux d’accès Blob, suppression réversible, contrôle de version, gestion du cycle de vie ; AzCopy</w:t>
             </w:r>
           </w:p>
         </w:tc>
@@ -1762,7 +1762,7 @@
               <w:pStyle w:val="ProgTableText"/>
             </w:pPr>
             <w:r>
-              <w:t>VM, groupes à haute disponibilité et zones, groupes identiques, déploiement avec modèles ARM et Bicep</w:t>
+              <w:t>VM, disques et chiffrement sur l’hôte, redimensionnement et déplacement de VM, groupes à haute disponibilité et zones, groupes identiques ; modèles ARM et Bicep : déployer, exporter, convertir</w:t>
             </w:r>
           </w:p>
         </w:tc>
@@ -1829,7 +1829,7 @@
               <w:pStyle w:val="ProgTableText"/>
             </w:pPr>
             <w:r>
-              <w:t>Plans App Service et emplacements de déploiement, Container Instances, Container Apps</w:t>
+              <w:t>Plans App Service, mise à l’échelle, certificats TLS, domaines personnalisés, sauvegarde, emplacements de déploiement ; Azure Container Registry, Container Instances, Container Apps</w:t>
             </w:r>
           </w:p>
         </w:tc>
@@ -1876,7 +1876,7 @@
         <w:pStyle w:val="Heading1"/>
       </w:pPr>
       <w:r>
-        <w:t>Supervision, sauvegarde et préparation à l’examen</w:t>
+        <w:t>Supervision et sauvegarde</w:t>
       </w:r>
     </w:p>
     <w:p>
@@ -1884,7 +1884,7 @@
         <w:pStyle w:val="ProgIntro"/>
       </w:pPr>
       <w:r>
-        <w:t>Les participants collectent métriques et journaux avec Azure Monitor et Log Analytics, créent des alertes, diagnostiquent la connectivité avec Network Watcher, protègent les charges avec Azure Backup et Site Recovery, puis s’entraînent sur des questions AZ-104. TP validé : une VM restaurée depuis Azure Backup après la suppression d’un fichier, et une alerte déclenchée par une requête KQL dans Log Analytics.</w:t>
+        <w:t>Les participants collectent métriques et journaux avec Azure Monitor et Log Analytics, créent des alertes, diagnostiquent la connectivité avec Network Watcher, protègent les charges avec Azure Backup et Site Recovery, puis s’entraînent sur des questions AZ-104. TP validé : un fichier supprimé récupéré depuis un point de récupération Azure Backup d’une VM, et une alerte déclenchée par une requête KQL dans Log Analytics.</w:t>
       </w:r>
     </w:p>
     <w:tbl>
@@ -2006,7 +2006,7 @@
               <w:pStyle w:val="ProgTableText"/>
             </w:pPr>
             <w:r>
-              <w:t>Azure Monitor, Log Analytics, alertes, Network Watcher, Azure Backup et Site Recovery</w:t>
+              <w:t>Azure Monitor, Log Analytics et KQL, alertes et groupes d’actions, insights VM et réseau, Network Watcher et Connection Monitor, coffres Recovery Services et Backup, Site Recovery</w:t>
             </w:r>
           </w:p>
         </w:tc>
@@ -2250,7 +2250,7 @@
               <w:pStyle w:val="ProgTableText"/>
             </w:pPr>
             <w:r>
-              <w:t>Analyser le besoin, puis mettre en place groupes Entra ID et RBAC, politiques, VNet en hub-and-spoke avec NSG, VM derrière un répartiteur de charge et stockage</w:t>
+              <w:t>Analyser le besoin, puis mettre en place groupes Entra ID et RBAC, stratégies, VNet en hub-and-spoke avec NSG, VM derrière un répartiteur de charge et stockage, déployés avec Bicep si possible</w:t>
             </w:r>
           </w:p>
         </w:tc>
@@ -2442,7 +2442,7 @@
         <w:pStyle w:val="ProgBoxText"/>
       </w:pPr>
       <w:r>
-        <w:t>L’environnement Azure d’une entreprise : groupes Entra ID avec RBAC, politiques qui imposent ses règles, réseaux virtuels en hub-and-spoke avec NSG, machines virtuelles derrière un répartiteur de charge, stockage, supervision avec alertes et sauvegarde testée.</w:t>
+        <w:t>L’environnement Azure d’une entreprise : groupes Entra ID avec RBAC, stratégies qui imposent ses règles, réseaux virtuels en hub-and-spoke avec NSG, machines virtuelles derrière un répartiteur de charge, stockage, supervision avec alertes et sauvegarde testée.</w:t>
       </w:r>
     </w:p>
     <w:p>

</xml_diff>